<commit_message>
Complete LR01 part B in Engee and update reports
</commit_message>
<xml_diff>
--- a/LR1_1/reports/ЛР01_Вариант_3_Отчёт.docx
+++ b/LR1_1/reports/ЛР01_Вариант_3_Отчёт.docx
@@ -3697,6 +3697,691 @@
         <w:pStyle w:val="Heading1"/>
       </w:pPr>
       <w:r>
+        <w:t>11. Часть Б — проверка облачной среды Engee</w:t>
+      </w:r>
+    </w:p>
+    <w:p>
+      <w:r>
+        <w:t xml:space="preserve">29.09.2026 в 22:47–22:58 MSK в авторизованной среде Engee выполнены действия методических указаний. Версия личного кабинета — </w:t>
+      </w:r>
+      <w:r>
+        <w:rPr>
+          <w:rFonts w:ascii="Consolas" w:hAnsi="Consolas"/>
+          <w:sz w:val="18"/>
+        </w:rPr>
+        <w:t>26.9.1.1</w:t>
+      </w:r>
+      <w:r>
+        <w:t xml:space="preserve"> (нижний левый угол бокового меню), версия рабочей среды — </w:t>
+      </w:r>
+      <w:r>
+        <w:rPr>
+          <w:rFonts w:ascii="Consolas" w:hAnsi="Consolas"/>
+          <w:sz w:val="18"/>
+        </w:rPr>
+        <w:t>26.9.2-H1</w:t>
+      </w:r>
+      <w:r>
+        <w:t xml:space="preserve"> (заголовок вкладки). В командной строке </w:t>
+      </w:r>
+      <w:r>
+        <w:rPr>
+          <w:rFonts w:ascii="Consolas" w:hAnsi="Consolas"/>
+          <w:sz w:val="18"/>
+        </w:rPr>
+        <w:t>VERSION</w:t>
+      </w:r>
+      <w:r>
+        <w:t xml:space="preserve"> вернул </w:t>
+      </w:r>
+      <w:r>
+        <w:rPr>
+          <w:rFonts w:ascii="Consolas" w:hAnsi="Consolas"/>
+          <w:sz w:val="18"/>
+        </w:rPr>
+        <w:t>v"1.12.4"</w:t>
+      </w:r>
+      <w:r>
+        <w:t xml:space="preserve">; </w:t>
+      </w:r>
+      <w:r>
+        <w:rPr>
+          <w:rFonts w:ascii="Consolas" w:hAnsi="Consolas"/>
+          <w:sz w:val="18"/>
+        </w:rPr>
+        <w:t>pwd()</w:t>
+      </w:r>
+      <w:r>
+        <w:t xml:space="preserve"> вернул </w:t>
+      </w:r>
+      <w:r>
+        <w:rPr>
+          <w:rFonts w:ascii="Consolas" w:hAnsi="Consolas"/>
+          <w:sz w:val="18"/>
+        </w:rPr>
+        <w:t>/user</w:t>
+      </w:r>
+      <w:r>
+        <w:t xml:space="preserve">. По </w:t>
+      </w:r>
+      <w:r>
+        <w:rPr>
+          <w:rFonts w:ascii="Consolas" w:hAnsi="Consolas"/>
+          <w:sz w:val="18"/>
+        </w:rPr>
+        <w:t>versioninfo()</w:t>
+      </w:r>
+      <w:r>
+        <w:t xml:space="preserve"> ядро работает на Linux x86_64, Julia 1.12.4. Эти сведения относятся к Engee; локальный эксперимент части А выполнен на macOS и Python.</w:t>
+      </w:r>
+    </w:p>
+    <w:p>
+      <w:r>
+        <w:t xml:space="preserve">В файловом дереве Engee создан </w:t>
+      </w:r>
+      <w:r>
+        <w:rPr>
+          <w:rFonts w:ascii="Consolas" w:hAnsi="Consolas"/>
+          <w:sz w:val="18"/>
+        </w:rPr>
+        <w:t>/user/AI_in_creative_media/LR01</w:t>
+      </w:r>
+      <w:r>
+        <w:t xml:space="preserve">. Интерфейс показывает команды «Файлы», «Создать», «Папку», «Скрипт», </w:t>
+      </w:r>
+      <w:r>
+        <w:rPr>
+          <w:rFonts w:ascii="Consolas" w:hAnsi="Consolas"/>
+          <w:sz w:val="18"/>
+        </w:rPr>
+        <w:t>.ngscript</w:t>
+      </w:r>
+      <w:r>
+        <w:t xml:space="preserve">, «Редактор скриптов», «Переменные» и «Командная строка». В данной сессии подменю «Создать» не открылось при выборе мышью, поэтому папки созданы командой </w:t>
+      </w:r>
+      <w:r>
+        <w:rPr>
+          <w:rFonts w:ascii="Consolas" w:hAnsi="Consolas"/>
+          <w:sz w:val="18"/>
+        </w:rPr>
+        <w:t>mkpath("AI_in_creative_media/LR01")</w:t>
+      </w:r>
+      <w:r>
+        <w:t xml:space="preserve">, а подготовленный файл </w:t>
+      </w:r>
+      <w:r>
+        <w:rPr>
+          <w:rFonts w:ascii="Consolas" w:hAnsi="Consolas"/>
+          <w:sz w:val="18"/>
+        </w:rPr>
+        <w:t>LR01_environment.ngscript</w:t>
+      </w:r>
+      <w:r>
+        <w:t xml:space="preserve"> загружен кнопкой панели «Файлы». Наличие обоих объектов проверено в дереве.</w:t>
+      </w:r>
+    </w:p>
+    <w:p>
+      <w:r>
+        <w:t xml:space="preserve">Одна кодовая ячейка </w:t>
+      </w:r>
+      <w:r>
+        <w:rPr>
+          <w:rFonts w:ascii="Consolas" w:hAnsi="Consolas"/>
+          <w:sz w:val="18"/>
+        </w:rPr>
+        <w:t>LR01_environment.ngscript</w:t>
+      </w:r>
+      <w:r>
+        <w:t xml:space="preserve"> с </w:t>
+      </w:r>
+      <w:r>
+        <w:rPr>
+          <w:rFonts w:ascii="Consolas" w:hAnsi="Consolas"/>
+          <w:sz w:val="18"/>
+        </w:rPr>
+        <w:t>println("VERSION = ", VERSION)</w:t>
+      </w:r>
+      <w:r>
+        <w:t xml:space="preserve"> и </w:t>
+      </w:r>
+      <w:r>
+        <w:rPr>
+          <w:rFonts w:ascii="Consolas" w:hAnsi="Consolas"/>
+          <w:sz w:val="18"/>
+        </w:rPr>
+        <w:t>versioninfo()</w:t>
+      </w:r>
+      <w:r>
+        <w:t xml:space="preserve"> выполнена в редакторе: статус «Выполнено», ошибок нет. После сохранения статус стал «Сохранено», файл скачан с сохранённым </w:t>
+      </w:r>
+      <w:r>
+        <w:rPr>
+          <w:rFonts w:ascii="Consolas" w:hAnsi="Consolas"/>
+          <w:sz w:val="18"/>
+        </w:rPr>
+        <w:t>stdout</w:t>
+      </w:r>
+      <w:r>
+        <w:t xml:space="preserve">. Исполненный сценарий — </w:t>
+      </w:r>
+      <w:r>
+        <w:rPr>
+          <w:rFonts w:ascii="Consolas" w:hAnsi="Consolas"/>
+          <w:sz w:val="18"/>
+        </w:rPr>
+        <w:t>engee/LR01_environment.ngscript</w:t>
+      </w:r>
+      <w:r>
+        <w:t xml:space="preserve">, отдельная точная копия вывода — </w:t>
+      </w:r>
+      <w:r>
+        <w:rPr>
+          <w:rFonts w:ascii="Consolas" w:hAnsi="Consolas"/>
+          <w:sz w:val="18"/>
+        </w:rPr>
+        <w:t>engee/versioninfo.txt</w:t>
+      </w:r>
+      <w:r>
+        <w:t xml:space="preserve">. Паспорт среды </w:t>
+      </w:r>
+      <w:r>
+        <w:rPr>
+          <w:rFonts w:ascii="Consolas" w:hAnsi="Consolas"/>
+          <w:sz w:val="18"/>
+        </w:rPr>
+        <w:t>engee/passport.md</w:t>
+      </w:r>
+      <w:r>
+        <w:t xml:space="preserve"> загружен в папку LR01 на сервере; протокол команд — </w:t>
+      </w:r>
+      <w:r>
+        <w:rPr>
+          <w:rFonts w:ascii="Consolas" w:hAnsi="Consolas"/>
+          <w:sz w:val="18"/>
+        </w:rPr>
+        <w:t>engee/session.log</w:t>
+      </w:r>
+      <w:r>
+        <w:t>.</w:t>
+      </w:r>
+    </w:p>
+    <w:p>
+      <w:r>
+        <w:t xml:space="preserve">Для проверки рабочей области исполнено </w:t>
+      </w:r>
+      <w:r>
+        <w:rPr>
+          <w:rFonts w:ascii="Consolas" w:hAnsi="Consolas"/>
+          <w:sz w:val="18"/>
+        </w:rPr>
+        <w:t>seed = 101</w:t>
+      </w:r>
+      <w:r>
+        <w:t xml:space="preserve">. Панель «Переменные» показала </w:t>
+      </w:r>
+      <w:r>
+        <w:rPr>
+          <w:rFonts w:ascii="Consolas" w:hAnsi="Consolas"/>
+          <w:sz w:val="18"/>
+        </w:rPr>
+        <w:t>seed = 101</w:t>
+      </w:r>
+      <w:r>
+        <w:t xml:space="preserve">, класс </w:t>
+      </w:r>
+      <w:r>
+        <w:rPr>
+          <w:rFonts w:ascii="Consolas" w:hAnsi="Consolas"/>
+          <w:sz w:val="18"/>
+        </w:rPr>
+        <w:t>Int64</w:t>
+      </w:r>
+      <w:r>
+        <w:t xml:space="preserve">, и служебный </w:t>
+      </w:r>
+      <w:r>
+        <w:rPr>
+          <w:rFonts w:ascii="Consolas" w:hAnsi="Consolas"/>
+          <w:sz w:val="18"/>
+        </w:rPr>
+        <w:t>ans = 101</w:t>
+      </w:r>
+      <w:r>
+        <w:t xml:space="preserve">. После команды «Очистить все переменные» и подтверждения «Да» </w:t>
+      </w:r>
+      <w:r>
+        <w:rPr>
+          <w:rFonts w:ascii="Consolas" w:hAnsi="Consolas"/>
+          <w:sz w:val="18"/>
+        </w:rPr>
+        <w:t>seed</w:t>
+      </w:r>
+      <w:r>
+        <w:t xml:space="preserve"> исчез, </w:t>
+      </w:r>
+      <w:r>
+        <w:rPr>
+          <w:rFonts w:ascii="Consolas" w:hAnsi="Consolas"/>
+          <w:sz w:val="18"/>
+        </w:rPr>
+        <w:t>ans</w:t>
+      </w:r>
+      <w:r>
+        <w:t xml:space="preserve"> остался. После команды «Перезапуск ядра» и подтверждения «Перезапустить» </w:t>
+      </w:r>
+      <w:r>
+        <w:rPr>
+          <w:rFonts w:ascii="Consolas" w:hAnsi="Consolas"/>
+          <w:sz w:val="18"/>
+        </w:rPr>
+        <w:t>seed</w:t>
+      </w:r>
+      <w:r>
+        <w:t xml:space="preserve"> по-прежнему отсутствовал. Дополнительная проверка </w:t>
+      </w:r>
+      <w:r>
+        <w:rPr>
+          <w:rFonts w:ascii="Consolas" w:hAnsi="Consolas"/>
+          <w:sz w:val="18"/>
+        </w:rPr>
+        <w:t>(isdefined(Main, :seed), isdefined(Main, :ans))</w:t>
+      </w:r>
+      <w:r>
+        <w:t xml:space="preserve"> дала </w:t>
+      </w:r>
+      <w:r>
+        <w:rPr>
+          <w:rFonts w:ascii="Consolas" w:hAnsi="Consolas"/>
+          <w:sz w:val="18"/>
+        </w:rPr>
+        <w:t>(false, true)</w:t>
+      </w:r>
+      <w:r>
+        <w:t>. Это фактическая особенность текущего интерфейса; в паспорте не сделан неверный вывод о пустой таблице.</w:t>
+      </w:r>
+    </w:p>
+    <w:p>
+      <w:pPr>
+        <w:pStyle w:val="Heading2"/>
+      </w:pPr>
+      <w:r>
+        <w:t>11.1. Необработанный вывод ячейки Engee</w:t>
+      </w:r>
+    </w:p>
+    <w:p>
+      <w:r>
+        <w:t xml:space="preserve">Полный вывод </w:t>
+      </w:r>
+      <w:r>
+        <w:rPr>
+          <w:rFonts w:ascii="Consolas" w:hAnsi="Consolas"/>
+          <w:sz w:val="18"/>
+        </w:rPr>
+        <w:t>VERSION</w:t>
+      </w:r>
+      <w:r>
+        <w:t xml:space="preserve"> и </w:t>
+      </w:r>
+      <w:r>
+        <w:rPr>
+          <w:rFonts w:ascii="Consolas" w:hAnsi="Consolas"/>
+          <w:sz w:val="18"/>
+        </w:rPr>
+        <w:t>versioninfo()</w:t>
+      </w:r>
+      <w:r>
+        <w:t xml:space="preserve"> приведён в </w:t>
+      </w:r>
+      <w:r>
+        <w:rPr>
+          <w:rFonts w:ascii="Consolas" w:hAnsi="Consolas"/>
+          <w:sz w:val="18"/>
+        </w:rPr>
+        <w:t>engee/passport.md</w:t>
+      </w:r>
+      <w:r>
+        <w:t xml:space="preserve"> и сохранён без обработки в исполняемом </w:t>
+      </w:r>
+      <w:r>
+        <w:rPr>
+          <w:rFonts w:ascii="Consolas" w:hAnsi="Consolas"/>
+          <w:sz w:val="18"/>
+        </w:rPr>
+        <w:t>.ngscript</w:t>
+      </w:r>
+      <w:r>
+        <w:t>. Ниже приведены первые диагностические строки:</w:t>
+      </w:r>
+    </w:p>
+    <w:p>
+      <w:pPr>
+        <w:ind w:left="227"/>
+      </w:pPr>
+      <w:r>
+        <w:rPr>
+          <w:rFonts w:ascii="Consolas" w:hAnsi="Consolas"/>
+          <w:sz w:val="17"/>
+        </w:rPr>
+        <w:t>VERSION = 1.12.4</w:t>
+      </w:r>
+    </w:p>
+    <w:p>
+      <w:pPr>
+        <w:ind w:left="227"/>
+      </w:pPr>
+      <w:r>
+        <w:rPr>
+          <w:rFonts w:ascii="Consolas" w:hAnsi="Consolas"/>
+          <w:sz w:val="17"/>
+        </w:rPr>
+        <w:t>Julia Version 1.12.4</w:t>
+      </w:r>
+    </w:p>
+    <w:p>
+      <w:pPr>
+        <w:ind w:left="227"/>
+      </w:pPr>
+      <w:r>
+        <w:rPr>
+          <w:rFonts w:ascii="Consolas" w:hAnsi="Consolas"/>
+          <w:sz w:val="17"/>
+        </w:rPr>
+        <w:t>Commit 01a2eadb047 (2026-01-06 16:56 UTC)</w:t>
+      </w:r>
+    </w:p>
+    <w:p>
+      <w:pPr>
+        <w:ind w:left="227"/>
+      </w:pPr>
+      <w:r>
+        <w:rPr>
+          <w:rFonts w:ascii="Consolas" w:hAnsi="Consolas"/>
+          <w:sz w:val="17"/>
+        </w:rPr>
+        <w:t>Build Info:</w:t>
+      </w:r>
+    </w:p>
+    <w:p>
+      <w:pPr>
+        <w:ind w:left="227"/>
+      </w:pPr>
+      <w:r>
+        <w:rPr>
+          <w:rFonts w:ascii="Consolas" w:hAnsi="Consolas"/>
+          <w:sz w:val="17"/>
+        </w:rPr>
+        <w:t>Official https://julialang.org release</w:t>
+      </w:r>
+    </w:p>
+    <w:p>
+      <w:pPr>
+        <w:ind w:left="227"/>
+      </w:pPr>
+      <w:r>
+        <w:rPr>
+          <w:rFonts w:ascii="Consolas" w:hAnsi="Consolas"/>
+          <w:sz w:val="17"/>
+        </w:rPr>
+        <w:t>Platform Info:</w:t>
+      </w:r>
+    </w:p>
+    <w:p>
+      <w:pPr>
+        <w:ind w:left="227"/>
+      </w:pPr>
+      <w:r>
+        <w:rPr>
+          <w:rFonts w:ascii="Consolas" w:hAnsi="Consolas"/>
+          <w:sz w:val="17"/>
+        </w:rPr>
+        <w:t>OS: Linux (x86_64-linux-gnu)</w:t>
+      </w:r>
+    </w:p>
+    <w:p>
+      <w:pPr>
+        <w:ind w:left="227"/>
+      </w:pPr>
+      <w:r>
+        <w:rPr>
+          <w:rFonts w:ascii="Consolas" w:hAnsi="Consolas"/>
+          <w:sz w:val="17"/>
+        </w:rPr>
+        <w:t>CPU: 112 × Intel(R) Xeon(R) Platinum 8180 CPU @ 2.50GHz</w:t>
+      </w:r>
+    </w:p>
+    <w:p>
+      <w:pPr>
+        <w:ind w:left="227"/>
+      </w:pPr>
+      <w:r>
+        <w:rPr>
+          <w:rFonts w:ascii="Consolas" w:hAnsi="Consolas"/>
+          <w:sz w:val="17"/>
+        </w:rPr>
+        <w:t>WORD_SIZE: 64</w:t>
+      </w:r>
+    </w:p>
+    <w:p>
+      <w:pPr>
+        <w:ind w:left="227"/>
+      </w:pPr>
+      <w:r>
+        <w:rPr>
+          <w:rFonts w:ascii="Consolas" w:hAnsi="Consolas"/>
+          <w:sz w:val="17"/>
+        </w:rPr>
+        <w:t>LLVM: libLLVM-18.1.7 (ORCJIT, skylake-avx512)</w:t>
+      </w:r>
+    </w:p>
+    <w:p>
+      <w:pPr>
+        <w:ind w:left="227"/>
+      </w:pPr>
+      <w:r>
+        <w:rPr>
+          <w:rFonts w:ascii="Consolas" w:hAnsi="Consolas"/>
+          <w:sz w:val="17"/>
+        </w:rPr>
+        <w:t>GC: Built with stock GC</w:t>
+      </w:r>
+    </w:p>
+    <w:p>
+      <w:pPr>
+        <w:ind w:left="227"/>
+      </w:pPr>
+      <w:r>
+        <w:rPr>
+          <w:rFonts w:ascii="Consolas" w:hAnsi="Consolas"/>
+          <w:sz w:val="17"/>
+        </w:rPr>
+        <w:t>Threads: 5 default, 3 interactive, 5 GC (on 112 virtual cores)</w:t>
+      </w:r>
+    </w:p>
+    <w:p>
+      <w:pPr>
+        <w:ind w:left="227"/>
+      </w:pPr>
+      <w:r>
+        <w:rPr>
+          <w:rFonts w:ascii="Consolas" w:hAnsi="Consolas"/>
+          <w:sz w:val="17"/>
+        </w:rPr>
+        <w:t>Environment:</w:t>
+      </w:r>
+    </w:p>
+    <w:p>
+      <w:pPr>
+        <w:ind w:left="227"/>
+      </w:pPr>
+      <w:r>
+        <w:rPr>
+          <w:rFonts w:ascii="Consolas" w:hAnsi="Consolas"/>
+          <w:sz w:val="17"/>
+        </w:rPr>
+        <w:t>JULIA_LSP_STORE_PATH = /user/lsp_store</w:t>
+      </w:r>
+    </w:p>
+    <w:p>
+      <w:pPr>
+        <w:ind w:left="227"/>
+      </w:pPr>
+      <w:r>
+        <w:rPr>
+          <w:rFonts w:ascii="Consolas" w:hAnsi="Consolas"/>
+          <w:sz w:val="17"/>
+        </w:rPr>
+        <w:t>JULIA_CPU_TARGET = generic;sandybridge,-xsaveopt,clone_all;haswell,-rdrnd,base(1)</w:t>
+      </w:r>
+    </w:p>
+    <w:p>
+      <w:pPr>
+        <w:ind w:left="227"/>
+      </w:pPr>
+      <w:r>
+        <w:rPr>
+          <w:rFonts w:ascii="Consolas" w:hAnsi="Consolas"/>
+          <w:sz w:val="17"/>
+        </w:rPr>
+        <w:t>JULIA_LSP_PORT = 3751</w:t>
+      </w:r>
+    </w:p>
+    <w:p>
+      <w:pPr>
+        <w:ind w:left="227"/>
+      </w:pPr>
+      <w:r>
+        <w:rPr>
+          <w:rFonts w:ascii="Consolas" w:hAnsi="Consolas"/>
+          <w:sz w:val="17"/>
+        </w:rPr>
+        <w:t>JULIA_NUM_PRECOMPILE_TASKS = 8</w:t>
+      </w:r>
+    </w:p>
+    <w:p>
+      <w:pPr>
+        <w:ind w:left="227"/>
+      </w:pPr>
+      <w:r>
+        <w:rPr>
+          <w:rFonts w:ascii="Consolas" w:hAnsi="Consolas"/>
+          <w:sz w:val="17"/>
+        </w:rPr>
+        <w:t>JULIA_PKG_PRECOMPILE_AUTO = 0</w:t>
+      </w:r>
+    </w:p>
+    <w:p>
+      <w:pPr>
+        <w:ind w:left="227"/>
+      </w:pPr>
+      <w:r>
+        <w:rPr>
+          <w:rFonts w:ascii="Consolas" w:hAnsi="Consolas"/>
+          <w:sz w:val="17"/>
+        </w:rPr>
+        <w:t>JULIA_DEPOT_PATH = /user/.packages:/opt/depot/core:/opt/depot/mtl:/opt/depot/demos:/opt/depot/stdlib</w:t>
+      </w:r>
+    </w:p>
+    <w:p>
+      <w:pPr>
+        <w:ind w:left="227"/>
+      </w:pPr>
+      <w:r>
+        <w:rPr>
+          <w:rFonts w:ascii="Consolas" w:hAnsi="Consolas"/>
+          <w:sz w:val="17"/>
+        </w:rPr>
+        <w:t>JULIA_PATH = /usr/local/julia</w:t>
+      </w:r>
+    </w:p>
+    <w:p>
+      <w:pPr>
+        <w:ind w:left="227"/>
+      </w:pPr>
+      <w:r>
+        <w:rPr>
+          <w:rFonts w:ascii="Consolas" w:hAnsi="Consolas"/>
+          <w:sz w:val="17"/>
+        </w:rPr>
+        <w:t>LD_LIBRARY_PATH = /usr/local/nvidia/lib:/usr/local/nvidia/lib64</w:t>
+      </w:r>
+    </w:p>
+    <w:p>
+      <w:pPr>
+        <w:ind w:left="227"/>
+      </w:pPr>
+      <w:r>
+        <w:rPr>
+          <w:rFonts w:ascii="Consolas" w:hAnsi="Consolas"/>
+          <w:sz w:val="17"/>
+        </w:rPr>
+        <w:t>JULIA_PROJECT = /user/.project/</w:t>
+      </w:r>
+    </w:p>
+    <w:p>
+      <w:pPr>
+        <w:ind w:left="227"/>
+      </w:pPr>
+      <w:r>
+        <w:rPr>
+          <w:rFonts w:ascii="Consolas" w:hAnsi="Consolas"/>
+          <w:sz w:val="17"/>
+        </w:rPr>
+        <w:t>JULIA_DA_STORE_PATH = /user/da_store</w:t>
+      </w:r>
+    </w:p>
+    <w:p>
+      <w:pPr>
+        <w:ind w:left="227"/>
+      </w:pPr>
+      <w:r>
+        <w:rPr>
+          <w:rFonts w:ascii="Consolas" w:hAnsi="Consolas"/>
+          <w:sz w:val="17"/>
+        </w:rPr>
+        <w:t>JULIA_PKG_SERVER = http://pkgserver.pkgserver.svc.cluster.local</w:t>
+      </w:r>
+    </w:p>
+    <w:p>
+      <w:pPr>
+        <w:ind w:left="227"/>
+      </w:pPr>
+      <w:r>
+        <w:rPr>
+          <w:rFonts w:ascii="Consolas" w:hAnsi="Consolas"/>
+          <w:sz w:val="17"/>
+        </w:rPr>
+        <w:t>JULIA_NUM_THREADS = 7,1</w:t>
+      </w:r>
+    </w:p>
+    <w:p>
+      <w:pPr>
+        <w:ind w:left="227"/>
+      </w:pPr>
+      <w:r>
+        <w:rPr>
+          <w:rFonts w:ascii="Consolas" w:hAnsi="Consolas"/>
+          <w:sz w:val="17"/>
+        </w:rPr>
+        <w:t>JULIA_DA_PORT = 3752</w:t>
+      </w:r>
+    </w:p>
+    <w:p>
+      <w:pPr>
+        <w:ind w:left="227"/>
+      </w:pPr>
+      <w:r>
+        <w:rPr>
+          <w:rFonts w:ascii="Consolas" w:hAnsi="Consolas"/>
+          <w:sz w:val="17"/>
+        </w:rPr>
+        <w:t>JULIA_DEBUG = BackendLib,AbstractAPI</w:t>
+      </w:r>
+    </w:p>
+    <w:p>
+      <w:pPr>
+        <w:pStyle w:val="Heading1"/>
+      </w:pPr>
+      <w:r>
         <w:t>Приложение А Полный паспорт эксперимента</w:t>
       </w:r>
     </w:p>
@@ -4192,11 +4877,6 @@
       </w:r>
       <w:r>
         <w:t>69257206dab50ef35de448b45764daad0d4f60dbc98febd8953c6faee28e06b5</w:t>
-      </w:r>
-    </w:p>
-    <w:p>
-      <w:r>
-        <w:br w:type="page"/>
       </w:r>
     </w:p>
     <w:p>
@@ -5197,19 +5877,6 @@
         <w:t>.venv/bin/python src/lab01_experiment.py --variant 3 --out artifacts/variant03</w:t>
       </w:r>
     </w:p>
-    <w:p>
-      <w:pPr>
-        <w:pStyle w:val="Heading2"/>
-      </w:pPr>
-      <w:r>
-        <w:t>Состав архива артефактов</w:t>
-      </w:r>
-    </w:p>
-    <w:p>
-      <w:r>
-        <w:t>Архив LR1_1_submission.zip содержит исходные скрипты, requirements.txt, предварительную гипотезу, среду и журналы, паспорт в MD и JSON, результаты и PNG основного эксперимента, выполненный ноутбук с его выводами, повторные результаты и диагностику seed, таблицу метрик по каждому seed, а также этот отчёт. Папка .venv не включена; она пересоздаётся по команде выше.</w:t>
-      </w:r>
-    </w:p>
     <w:sectPr>
       <w:pgSz w:w="12240" w:h="15840"/>
       <w:pgMar w:top="1134" w:right="1134" w:bottom="1020" w:left="1332" w:header="720" w:footer="720" w:gutter="0"/>

</xml_diff>